<commit_message>
M3: Synthetic data generated; dataflow documented
</commit_message>
<xml_diff>
--- a/AthleteIQ.docx
+++ b/AthleteIQ.docx
@@ -786,14 +786,26 @@
           </w:tcPr>
           <w:p>
             <w:pPr>
+              <w:pStyle w:val="ListParagraph"/>
+              <w:numPr>
+                <w:ilvl w:val="0"/>
+                <w:numId w:val="10"/>
+              </w:numPr>
               <w:spacing w:after="0" w:line="240" w:lineRule="auto"/>
-              <w:jc w:val="center"/>
               <w:rPr>
                 <w:rFonts w:ascii="Times New Roman" w:eastAsia="Times New Roman" w:hAnsi="Times New Roman" w:cs="Times New Roman"/>
                 <w:sz w:val="24"/>
                 <w:szCs w:val="24"/>
               </w:rPr>
             </w:pPr>
+            <w:r>
+              <w:rPr>
+                <w:rFonts w:ascii="Times New Roman" w:eastAsia="Times New Roman" w:hAnsi="Times New Roman" w:cs="Times New Roman"/>
+                <w:sz w:val="24"/>
+                <w:szCs w:val="24"/>
+              </w:rPr>
+              <w:t>Normalization and redundancy checks</w:t>
+            </w:r>
           </w:p>
         </w:tc>
         <w:tc>
@@ -812,6 +824,14 @@
                 <w:szCs w:val="24"/>
               </w:rPr>
             </w:pPr>
+            <w:r>
+              <w:rPr>
+                <w:rFonts w:ascii="Times New Roman" w:eastAsia="Times New Roman" w:hAnsi="Times New Roman" w:cs="Times New Roman"/>
+                <w:sz w:val="24"/>
+                <w:szCs w:val="24"/>
+              </w:rPr>
+              <w:t>V 1.1</w:t>
+            </w:r>
           </w:p>
         </w:tc>
         <w:tc>
@@ -830,6 +850,14 @@
                 <w:szCs w:val="24"/>
               </w:rPr>
             </w:pPr>
+            <w:r>
+              <w:rPr>
+                <w:rFonts w:ascii="Times New Roman" w:eastAsia="Times New Roman" w:hAnsi="Times New Roman" w:cs="Times New Roman"/>
+                <w:sz w:val="24"/>
+                <w:szCs w:val="24"/>
+              </w:rPr>
+              <w:t>12/5/26</w:t>
+            </w:r>
           </w:p>
         </w:tc>
         <w:tc>

</xml_diff>

<commit_message>
M4: DDL scripts added, EER diagram verified
</commit_message>
<xml_diff>
--- a/AthleteIQ.docx
+++ b/AthleteIQ.docx
@@ -536,20 +536,20 @@
         <w:tblLook w:val="04A0" w:firstRow="1" w:lastRow="0" w:firstColumn="1" w:lastColumn="0" w:noHBand="0" w:noVBand="1"/>
       </w:tblPr>
       <w:tblGrid>
-        <w:gridCol w:w="2669"/>
-        <w:gridCol w:w="2669"/>
-        <w:gridCol w:w="2669"/>
-        <w:gridCol w:w="2669"/>
+        <w:gridCol w:w="2661"/>
+        <w:gridCol w:w="2661"/>
+        <w:gridCol w:w="2661"/>
+        <w:gridCol w:w="2661"/>
       </w:tblGrid>
       <w:tr>
         <w:trPr>
           <w:cnfStyle w:val="100000000000" w:firstRow="1" w:lastRow="0" w:firstColumn="0" w:lastColumn="0" w:oddVBand="0" w:evenVBand="0" w:oddHBand="0" w:evenHBand="0" w:firstRowFirstColumn="0" w:firstRowLastColumn="0" w:lastRowFirstColumn="0" w:lastRowLastColumn="0"/>
-          <w:trHeight w:val="777"/>
+          <w:trHeight w:val="1037"/>
         </w:trPr>
         <w:tc>
           <w:tcPr>
             <w:cnfStyle w:val="001000000000" w:firstRow="0" w:lastRow="0" w:firstColumn="1" w:lastColumn="0" w:oddVBand="0" w:evenVBand="0" w:oddHBand="0" w:evenHBand="0" w:firstRowFirstColumn="0" w:firstRowLastColumn="0" w:lastRowFirstColumn="0" w:lastRowLastColumn="0"/>
-            <w:tcW w:w="2669" w:type="dxa"/>
+            <w:tcW w:w="2661" w:type="dxa"/>
             <w:vAlign w:val="center"/>
           </w:tcPr>
           <w:p>
@@ -575,7 +575,7 @@
         </w:tc>
         <w:tc>
           <w:tcPr>
-            <w:tcW w:w="2669" w:type="dxa"/>
+            <w:tcW w:w="2661" w:type="dxa"/>
             <w:vAlign w:val="center"/>
           </w:tcPr>
           <w:p>
@@ -601,7 +601,7 @@
         </w:tc>
         <w:tc>
           <w:tcPr>
-            <w:tcW w:w="2669" w:type="dxa"/>
+            <w:tcW w:w="2661" w:type="dxa"/>
             <w:vAlign w:val="center"/>
           </w:tcPr>
           <w:p>
@@ -627,7 +627,7 @@
         </w:tc>
         <w:tc>
           <w:tcPr>
-            <w:tcW w:w="2669" w:type="dxa"/>
+            <w:tcW w:w="2661" w:type="dxa"/>
             <w:vAlign w:val="center"/>
           </w:tcPr>
           <w:p>
@@ -655,12 +655,12 @@
       <w:tr>
         <w:trPr>
           <w:cnfStyle w:val="000000100000" w:firstRow="0" w:lastRow="0" w:firstColumn="0" w:lastColumn="0" w:oddVBand="0" w:evenVBand="0" w:oddHBand="1" w:evenHBand="0" w:firstRowFirstColumn="0" w:firstRowLastColumn="0" w:lastRowFirstColumn="0" w:lastRowLastColumn="0"/>
-          <w:trHeight w:val="615"/>
+          <w:trHeight w:val="1097"/>
         </w:trPr>
         <w:tc>
           <w:tcPr>
             <w:cnfStyle w:val="001000000000" w:firstRow="0" w:lastRow="0" w:firstColumn="1" w:lastColumn="0" w:oddVBand="0" w:evenVBand="0" w:oddHBand="0" w:evenHBand="0" w:firstRowFirstColumn="0" w:firstRowLastColumn="0" w:lastRowFirstColumn="0" w:lastRowLastColumn="0"/>
-            <w:tcW w:w="2669" w:type="dxa"/>
+            <w:tcW w:w="2661" w:type="dxa"/>
             <w:vAlign w:val="center"/>
           </w:tcPr>
           <w:p>
@@ -689,7 +689,7 @@
         </w:tc>
         <w:tc>
           <w:tcPr>
-            <w:tcW w:w="2669" w:type="dxa"/>
+            <w:tcW w:w="2661" w:type="dxa"/>
             <w:vAlign w:val="center"/>
           </w:tcPr>
           <w:p>
@@ -715,7 +715,7 @@
         </w:tc>
         <w:tc>
           <w:tcPr>
-            <w:tcW w:w="2669" w:type="dxa"/>
+            <w:tcW w:w="2661" w:type="dxa"/>
             <w:vAlign w:val="center"/>
           </w:tcPr>
           <w:p>
@@ -757,7 +757,7 @@
         </w:tc>
         <w:tc>
           <w:tcPr>
-            <w:tcW w:w="2669" w:type="dxa"/>
+            <w:tcW w:w="2661" w:type="dxa"/>
             <w:vAlign w:val="center"/>
           </w:tcPr>
           <w:p>
@@ -776,12 +776,12 @@
       </w:tr>
       <w:tr>
         <w:trPr>
-          <w:trHeight w:val="573"/>
+          <w:trHeight w:val="1070"/>
         </w:trPr>
         <w:tc>
           <w:tcPr>
             <w:cnfStyle w:val="001000000000" w:firstRow="0" w:lastRow="0" w:firstColumn="1" w:lastColumn="0" w:oddVBand="0" w:evenVBand="0" w:oddHBand="0" w:evenHBand="0" w:firstRowFirstColumn="0" w:firstRowLastColumn="0" w:lastRowFirstColumn="0" w:lastRowLastColumn="0"/>
-            <w:tcW w:w="2669" w:type="dxa"/>
+            <w:tcW w:w="2661" w:type="dxa"/>
             <w:vAlign w:val="center"/>
           </w:tcPr>
           <w:p>
@@ -810,7 +810,7 @@
         </w:tc>
         <w:tc>
           <w:tcPr>
-            <w:tcW w:w="2669" w:type="dxa"/>
+            <w:tcW w:w="2661" w:type="dxa"/>
             <w:vAlign w:val="center"/>
           </w:tcPr>
           <w:p>
@@ -836,7 +836,7 @@
         </w:tc>
         <w:tc>
           <w:tcPr>
-            <w:tcW w:w="2669" w:type="dxa"/>
+            <w:tcW w:w="2661" w:type="dxa"/>
             <w:vAlign w:val="center"/>
           </w:tcPr>
           <w:p>
@@ -862,7 +862,7 @@
         </w:tc>
         <w:tc>
           <w:tcPr>
-            <w:tcW w:w="2669" w:type="dxa"/>
+            <w:tcW w:w="2661" w:type="dxa"/>
             <w:vAlign w:val="center"/>
           </w:tcPr>
           <w:p>
@@ -882,29 +882,41 @@
       <w:tr>
         <w:trPr>
           <w:cnfStyle w:val="000000100000" w:firstRow="0" w:lastRow="0" w:firstColumn="0" w:lastColumn="0" w:oddVBand="0" w:evenVBand="0" w:oddHBand="1" w:evenHBand="0" w:firstRowFirstColumn="0" w:firstRowLastColumn="0" w:lastRowFirstColumn="0" w:lastRowLastColumn="0"/>
-          <w:trHeight w:val="573"/>
+          <w:trHeight w:val="1340"/>
         </w:trPr>
         <w:tc>
           <w:tcPr>
             <w:cnfStyle w:val="001000000000" w:firstRow="0" w:lastRow="0" w:firstColumn="1" w:lastColumn="0" w:oddVBand="0" w:evenVBand="0" w:oddHBand="0" w:evenHBand="0" w:firstRowFirstColumn="0" w:firstRowLastColumn="0" w:lastRowFirstColumn="0" w:lastRowLastColumn="0"/>
-            <w:tcW w:w="2669" w:type="dxa"/>
+            <w:tcW w:w="2661" w:type="dxa"/>
             <w:vAlign w:val="center"/>
           </w:tcPr>
           <w:p>
             <w:pPr>
+              <w:pStyle w:val="ListParagraph"/>
+              <w:numPr>
+                <w:ilvl w:val="0"/>
+                <w:numId w:val="10"/>
+              </w:numPr>
               <w:spacing w:after="0" w:line="240" w:lineRule="auto"/>
-              <w:jc w:val="center"/>
               <w:rPr>
                 <w:rFonts w:ascii="Times New Roman" w:eastAsia="Times New Roman" w:hAnsi="Times New Roman" w:cs="Times New Roman"/>
                 <w:sz w:val="24"/>
                 <w:szCs w:val="24"/>
               </w:rPr>
             </w:pPr>
+            <w:r>
+              <w:rPr>
+                <w:rFonts w:ascii="Times New Roman" w:eastAsia="Times New Roman" w:hAnsi="Times New Roman" w:cs="Times New Roman"/>
+                <w:sz w:val="24"/>
+                <w:szCs w:val="24"/>
+              </w:rPr>
+              <w:t>Generated synthetic data and Defined Data flow</w:t>
+            </w:r>
           </w:p>
         </w:tc>
         <w:tc>
           <w:tcPr>
-            <w:tcW w:w="2669" w:type="dxa"/>
+            <w:tcW w:w="2661" w:type="dxa"/>
             <w:vAlign w:val="center"/>
           </w:tcPr>
           <w:p>
@@ -918,11 +930,19 @@
                 <w:szCs w:val="24"/>
               </w:rPr>
             </w:pPr>
+            <w:r>
+              <w:rPr>
+                <w:rFonts w:ascii="Times New Roman" w:eastAsia="Times New Roman" w:hAnsi="Times New Roman" w:cs="Times New Roman"/>
+                <w:sz w:val="24"/>
+                <w:szCs w:val="24"/>
+              </w:rPr>
+              <w:t>V 1.2</w:t>
+            </w:r>
           </w:p>
         </w:tc>
         <w:tc>
           <w:tcPr>
-            <w:tcW w:w="2669" w:type="dxa"/>
+            <w:tcW w:w="2661" w:type="dxa"/>
             <w:vAlign w:val="center"/>
           </w:tcPr>
           <w:p>
@@ -936,11 +956,19 @@
                 <w:szCs w:val="24"/>
               </w:rPr>
             </w:pPr>
+            <w:r>
+              <w:rPr>
+                <w:rFonts w:ascii="Times New Roman" w:eastAsia="Times New Roman" w:hAnsi="Times New Roman" w:cs="Times New Roman"/>
+                <w:sz w:val="24"/>
+                <w:szCs w:val="24"/>
+              </w:rPr>
+              <w:t>14/5/26</w:t>
+            </w:r>
           </w:p>
         </w:tc>
         <w:tc>
           <w:tcPr>
-            <w:tcW w:w="2669" w:type="dxa"/>
+            <w:tcW w:w="2661" w:type="dxa"/>
             <w:vAlign w:val="center"/>
           </w:tcPr>
           <w:p>
@@ -959,12 +987,12 @@
       </w:tr>
       <w:tr>
         <w:trPr>
-          <w:trHeight w:val="573"/>
+          <w:trHeight w:val="1097"/>
         </w:trPr>
         <w:tc>
           <w:tcPr>
             <w:cnfStyle w:val="001000000000" w:firstRow="0" w:lastRow="0" w:firstColumn="1" w:lastColumn="0" w:oddVBand="0" w:evenVBand="0" w:oddHBand="0" w:evenHBand="0" w:firstRowFirstColumn="0" w:firstRowLastColumn="0" w:lastRowFirstColumn="0" w:lastRowLastColumn="0"/>
-            <w:tcW w:w="2669" w:type="dxa"/>
+            <w:tcW w:w="2661" w:type="dxa"/>
             <w:vAlign w:val="center"/>
           </w:tcPr>
           <w:p>
@@ -977,11 +1005,35 @@
                 <w:szCs w:val="24"/>
               </w:rPr>
             </w:pPr>
+            <w:r>
+              <w:rPr>
+                <w:rFonts w:ascii="Times New Roman" w:eastAsia="Times New Roman" w:hAnsi="Times New Roman" w:cs="Times New Roman"/>
+                <w:sz w:val="24"/>
+                <w:szCs w:val="24"/>
+              </w:rPr>
+              <w:t>4.</w:t>
+            </w:r>
+            <w:r>
+              <w:rPr>
+                <w:rFonts w:ascii="Times New Roman" w:eastAsia="Times New Roman" w:hAnsi="Times New Roman" w:cs="Times New Roman"/>
+                <w:sz w:val="24"/>
+                <w:szCs w:val="24"/>
+              </w:rPr>
+              <w:t xml:space="preserve"> </w:t>
+            </w:r>
+            <w:r>
+              <w:rPr>
+                <w:rFonts w:ascii="Times New Roman" w:eastAsia="Times New Roman" w:hAnsi="Times New Roman" w:cs="Times New Roman"/>
+                <w:sz w:val="24"/>
+                <w:szCs w:val="24"/>
+              </w:rPr>
+              <w:t>DDL scripts implemented and EERD verified</w:t>
+            </w:r>
           </w:p>
         </w:tc>
         <w:tc>
           <w:tcPr>
-            <w:tcW w:w="2669" w:type="dxa"/>
+            <w:tcW w:w="2661" w:type="dxa"/>
             <w:vAlign w:val="center"/>
           </w:tcPr>
           <w:p>
@@ -995,11 +1047,19 @@
                 <w:szCs w:val="24"/>
               </w:rPr>
             </w:pPr>
+            <w:r>
+              <w:rPr>
+                <w:rFonts w:ascii="Times New Roman" w:eastAsia="Times New Roman" w:hAnsi="Times New Roman" w:cs="Times New Roman"/>
+                <w:sz w:val="24"/>
+                <w:szCs w:val="24"/>
+              </w:rPr>
+              <w:t>V 1.3</w:t>
+            </w:r>
           </w:p>
         </w:tc>
         <w:tc>
           <w:tcPr>
-            <w:tcW w:w="2669" w:type="dxa"/>
+            <w:tcW w:w="2661" w:type="dxa"/>
             <w:vAlign w:val="center"/>
           </w:tcPr>
           <w:p>
@@ -1013,11 +1073,19 @@
                 <w:szCs w:val="24"/>
               </w:rPr>
             </w:pPr>
+            <w:r>
+              <w:rPr>
+                <w:rFonts w:ascii="Times New Roman" w:eastAsia="Times New Roman" w:hAnsi="Times New Roman" w:cs="Times New Roman"/>
+                <w:sz w:val="24"/>
+                <w:szCs w:val="24"/>
+              </w:rPr>
+              <w:t>14/5/26</w:t>
+            </w:r>
           </w:p>
         </w:tc>
         <w:tc>
           <w:tcPr>
-            <w:tcW w:w="2669" w:type="dxa"/>
+            <w:tcW w:w="2661" w:type="dxa"/>
             <w:vAlign w:val="center"/>
           </w:tcPr>
           <w:p>
@@ -1037,12 +1105,12 @@
       <w:tr>
         <w:trPr>
           <w:cnfStyle w:val="000000100000" w:firstRow="0" w:lastRow="0" w:firstColumn="0" w:lastColumn="0" w:oddVBand="0" w:evenVBand="0" w:oddHBand="1" w:evenHBand="0" w:firstRowFirstColumn="0" w:firstRowLastColumn="0" w:lastRowFirstColumn="0" w:lastRowLastColumn="0"/>
-          <w:trHeight w:val="615"/>
+          <w:trHeight w:val="820"/>
         </w:trPr>
         <w:tc>
           <w:tcPr>
             <w:cnfStyle w:val="001000000000" w:firstRow="0" w:lastRow="0" w:firstColumn="1" w:lastColumn="0" w:oddVBand="0" w:evenVBand="0" w:oddHBand="0" w:evenHBand="0" w:firstRowFirstColumn="0" w:firstRowLastColumn="0" w:lastRowFirstColumn="0" w:lastRowLastColumn="0"/>
-            <w:tcW w:w="2669" w:type="dxa"/>
+            <w:tcW w:w="2661" w:type="dxa"/>
             <w:vAlign w:val="center"/>
           </w:tcPr>
           <w:p>
@@ -1059,7 +1127,7 @@
         </w:tc>
         <w:tc>
           <w:tcPr>
-            <w:tcW w:w="2669" w:type="dxa"/>
+            <w:tcW w:w="2661" w:type="dxa"/>
             <w:vAlign w:val="center"/>
           </w:tcPr>
           <w:p>
@@ -1077,7 +1145,7 @@
         </w:tc>
         <w:tc>
           <w:tcPr>
-            <w:tcW w:w="2669" w:type="dxa"/>
+            <w:tcW w:w="2661" w:type="dxa"/>
             <w:vAlign w:val="center"/>
           </w:tcPr>
           <w:p>
@@ -1095,7 +1163,7 @@
         </w:tc>
         <w:tc>
           <w:tcPr>
-            <w:tcW w:w="2669" w:type="dxa"/>
+            <w:tcW w:w="2661" w:type="dxa"/>
             <w:vAlign w:val="center"/>
           </w:tcPr>
           <w:p>
@@ -1114,12 +1182,12 @@
       </w:tr>
       <w:tr>
         <w:trPr>
-          <w:trHeight w:val="531"/>
+          <w:trHeight w:val="709"/>
         </w:trPr>
         <w:tc>
           <w:tcPr>
             <w:cnfStyle w:val="001000000000" w:firstRow="0" w:lastRow="0" w:firstColumn="1" w:lastColumn="0" w:oddVBand="0" w:evenVBand="0" w:oddHBand="0" w:evenHBand="0" w:firstRowFirstColumn="0" w:firstRowLastColumn="0" w:lastRowFirstColumn="0" w:lastRowLastColumn="0"/>
-            <w:tcW w:w="2669" w:type="dxa"/>
+            <w:tcW w:w="2661" w:type="dxa"/>
             <w:vAlign w:val="center"/>
           </w:tcPr>
           <w:p>
@@ -1136,7 +1204,7 @@
         </w:tc>
         <w:tc>
           <w:tcPr>
-            <w:tcW w:w="2669" w:type="dxa"/>
+            <w:tcW w:w="2661" w:type="dxa"/>
             <w:vAlign w:val="center"/>
           </w:tcPr>
           <w:p>
@@ -1154,7 +1222,7 @@
         </w:tc>
         <w:tc>
           <w:tcPr>
-            <w:tcW w:w="2669" w:type="dxa"/>
+            <w:tcW w:w="2661" w:type="dxa"/>
             <w:vAlign w:val="center"/>
           </w:tcPr>
           <w:p>
@@ -1172,7 +1240,7 @@
         </w:tc>
         <w:tc>
           <w:tcPr>
-            <w:tcW w:w="2669" w:type="dxa"/>
+            <w:tcW w:w="2661" w:type="dxa"/>
             <w:vAlign w:val="center"/>
           </w:tcPr>
           <w:p>

</xml_diff>

<commit_message>
Fixes in outputs Screenshots
</commit_message>
<xml_diff>
--- a/AthleteIQ.docx
+++ b/AthleteIQ.docx
@@ -13,6 +13,7 @@
           <w:szCs w:val="36"/>
         </w:rPr>
       </w:pPr>
+      <w:proofErr w:type="spellStart"/>
       <w:r>
         <w:rPr>
           <w:rFonts w:ascii="Microsoft Uighur" w:hAnsi="Microsoft Uighur" w:cs="Microsoft Uighur"/>
@@ -23,6 +24,7 @@
         </w:rPr>
         <w:t>AthleteIQ</w:t>
       </w:r>
+      <w:proofErr w:type="spellEnd"/>
     </w:p>
     <w:p>
       <w:pPr>
@@ -50,17 +52,6 @@
       <w:pPr>
         <w:jc w:val="center"/>
         <w:rPr>
-          <w:b/>
-          <w:color w:val="003399"/>
-          <w:sz w:val="48"/>
-          <w:szCs w:val="28"/>
-        </w:rPr>
-      </w:pPr>
-    </w:p>
-    <w:p>
-      <w:pPr>
-        <w:jc w:val="center"/>
-        <w:rPr>
           <w:rFonts w:ascii="Microsoft Uighur" w:hAnsi="Microsoft Uighur" w:cs="Microsoft Uighur"/>
           <w:b/>
           <w:color w:val="003399"/>
@@ -70,27 +61,6 @@
       </w:pPr>
       <w:r>
         <w:rPr>
-          <w:rFonts w:ascii="Microsoft Uighur" w:hAnsi="Microsoft Uighur" w:cs="Microsoft Uighur"/>
-          <w:b/>
-          <w:color w:val="003399"/>
-          <w:sz w:val="56"/>
-          <w:szCs w:val="36"/>
-        </w:rPr>
-        <w:t>Database Lab Project</w:t>
-      </w:r>
-    </w:p>
-    <w:p>
-      <w:pPr>
-        <w:rPr>
-          <w:rFonts w:ascii="Microsoft Uighur" w:hAnsi="Microsoft Uighur" w:cs="Microsoft Uighur"/>
-          <w:b/>
-          <w:color w:val="003399"/>
-          <w:sz w:val="48"/>
-          <w:szCs w:val="28"/>
-        </w:rPr>
-      </w:pPr>
-      <w:r>
-        <w:rPr>
           <w:rFonts w:ascii="Microsoft Uighur" w:eastAsia="Times New Roman" w:hAnsi="Microsoft Uighur" w:cs="Microsoft Uighur"/>
           <w:noProof/>
           <w:sz w:val="32"/>
@@ -99,21 +69,21 @@
         <mc:AlternateContent>
           <mc:Choice Requires="wps">
             <w:drawing>
-              <wp:anchor distT="45720" distB="45720" distL="114300" distR="114300" simplePos="0" relativeHeight="251660288" behindDoc="1" locked="0" layoutInCell="1" allowOverlap="1" wp14:anchorId="27999684" wp14:editId="4A300D22">
+              <wp:anchor distT="45720" distB="45720" distL="114300" distR="114300" simplePos="0" relativeHeight="251660288" behindDoc="1" locked="0" layoutInCell="1" allowOverlap="1" wp14:anchorId="27999684" wp14:editId="3488CBFE">
                 <wp:simplePos x="0" y="0"/>
-                <wp:positionH relativeFrom="column">
-                  <wp:posOffset>-10795</wp:posOffset>
+                <wp:positionH relativeFrom="margin">
+                  <wp:align>right</wp:align>
                 </wp:positionH>
                 <wp:positionV relativeFrom="paragraph">
-                  <wp:posOffset>387350</wp:posOffset>
+                  <wp:posOffset>640715</wp:posOffset>
                 </wp:positionV>
-                <wp:extent cx="6846570" cy="2860040"/>
-                <wp:effectExtent l="0" t="0" r="11430" b="16510"/>
+                <wp:extent cx="6846570" cy="3724275"/>
+                <wp:effectExtent l="0" t="0" r="11430" b="28575"/>
                 <wp:wrapTight wrapText="bothSides">
                   <wp:wrapPolygon edited="0">
                     <wp:start x="0" y="0"/>
-                    <wp:lineTo x="0" y="21581"/>
-                    <wp:lineTo x="21576" y="21581"/>
+                    <wp:lineTo x="0" y="21655"/>
+                    <wp:lineTo x="21576" y="21655"/>
                     <wp:lineTo x="21576" y="0"/>
                     <wp:lineTo x="0" y="0"/>
                   </wp:wrapPolygon>
@@ -131,7 +101,7 @@
                       <wps:spPr bwMode="auto">
                         <a:xfrm>
                           <a:off x="0" y="0"/>
-                          <a:ext cx="6846570" cy="2860040"/>
+                          <a:ext cx="6846570" cy="3724275"/>
                         </a:xfrm>
                         <a:prstGeom prst="rect">
                           <a:avLst/>
@@ -225,6 +195,13 @@
                           <w:p>
                             <w:pPr>
                               <w:jc w:val="center"/>
+                              <w:rPr>
+                                <w:rFonts w:ascii="Sitka Text" w:hAnsi="Sitka Text"/>
+                                <w:b/>
+                                <w:color w:val="002060"/>
+                                <w:sz w:val="40"/>
+                                <w:szCs w:val="32"/>
+                              </w:rPr>
                             </w:pPr>
                             <w:r>
                               <w:rPr>
@@ -237,6 +214,55 @@
                               <w:t>LAB Instructor: Mr. Ali Hasan</w:t>
                             </w:r>
                           </w:p>
+                          <w:p>
+                            <w:pPr>
+                              <w:jc w:val="center"/>
+                              <w:rPr>
+                                <w:rFonts w:ascii="Sitka Text" w:hAnsi="Sitka Text"/>
+                                <w:b/>
+                                <w:color w:val="002060"/>
+                                <w:sz w:val="40"/>
+                                <w:szCs w:val="32"/>
+                              </w:rPr>
+                            </w:pPr>
+                            <w:r>
+                              <w:rPr>
+                                <w:rFonts w:ascii="Sitka Text" w:hAnsi="Sitka Text"/>
+                                <w:b/>
+                                <w:color w:val="002060"/>
+                                <w:sz w:val="40"/>
+                                <w:szCs w:val="32"/>
+                              </w:rPr>
+                              <w:t xml:space="preserve">Repository: </w:t>
+                            </w:r>
+                          </w:p>
+                          <w:p>
+                            <w:pPr>
+                              <w:jc w:val="center"/>
+                              <w:rPr>
+                                <w:rFonts w:ascii="Sitka Text" w:hAnsi="Sitka Text"/>
+                                <w:b/>
+                                <w:color w:val="002060"/>
+                                <w:sz w:val="40"/>
+                                <w:szCs w:val="32"/>
+                              </w:rPr>
+                            </w:pPr>
+                            <w:r>
+                              <w:rPr>
+                                <w:rFonts w:ascii="Sitka Text" w:hAnsi="Sitka Text"/>
+                                <w:b/>
+                                <w:color w:val="002060"/>
+                                <w:sz w:val="40"/>
+                                <w:szCs w:val="32"/>
+                              </w:rPr>
+                              <w:t>https://github.com/ismailkhan1707/athleteIQ.git</w:t>
+                            </w:r>
+                          </w:p>
+                          <w:p>
+                            <w:pPr>
+                              <w:jc w:val="center"/>
+                            </w:pPr>
+                          </w:p>
                           <w:p/>
                           <w:p/>
                         </w:txbxContent>
@@ -247,6 +273,9 @@
                     </wps:wsp>
                   </a:graphicData>
                 </a:graphic>
+                <wp14:sizeRelV relativeFrom="margin">
+                  <wp14:pctHeight>0</wp14:pctHeight>
+                </wp14:sizeRelV>
               </wp:anchor>
             </w:drawing>
           </mc:Choice>
@@ -256,7 +285,7 @@
                 <v:stroke joinstyle="miter"/>
                 <v:path gradientshapeok="t" o:connecttype="rect"/>
               </v:shapetype>
-              <v:shape id="Text Box 2" o:spid="_x0000_s1026" type="#_x0000_t202" style="position:absolute;margin-left:-.85pt;margin-top:30.5pt;width:539.1pt;height:225.2pt;z-index:-251656192;visibility:visible;mso-wrap-style:square;mso-wrap-distance-left:9pt;mso-wrap-distance-top:3.6pt;mso-wrap-distance-right:9pt;mso-wrap-distance-bottom:3.6pt;mso-position-horizontal:absolute;mso-position-horizontal-relative:text;mso-position-vertical:absolute;mso-position-vertical-relative:text;v-text-anchor:top" o:gfxdata="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" fillcolor="#deeaf6 [660]" strokecolor="#5b9bd5 [3204]" strokeweight="1pt">
+              <v:shape id="Text Box 2" o:spid="_x0000_s1026" type="#_x0000_t202" style="position:absolute;left:0;text-align:left;margin-left:487.9pt;margin-top:50.45pt;width:539.1pt;height:293.25pt;z-index:-251656192;visibility:visible;mso-wrap-style:square;mso-height-percent:0;mso-wrap-distance-left:9pt;mso-wrap-distance-top:3.6pt;mso-wrap-distance-right:9pt;mso-wrap-distance-bottom:3.6pt;mso-position-horizontal:right;mso-position-horizontal-relative:margin;mso-position-vertical:absolute;mso-position-vertical-relative:text;mso-height-percent:0;mso-height-relative:margin;v-text-anchor:top" o:gfxdata="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" fillcolor="#deeaf6 [660]" strokecolor="#5b9bd5 [3204]" strokeweight="1pt">
                 <v:textbox>
                   <w:txbxContent>
                     <w:p>
@@ -325,6 +354,13 @@
                     <w:p>
                       <w:pPr>
                         <w:jc w:val="center"/>
+                        <w:rPr>
+                          <w:rFonts w:ascii="Sitka Text" w:hAnsi="Sitka Text"/>
+                          <w:b/>
+                          <w:color w:val="002060"/>
+                          <w:sz w:val="40"/>
+                          <w:szCs w:val="32"/>
+                        </w:rPr>
                       </w:pPr>
                       <w:r>
                         <w:rPr>
@@ -337,16 +373,86 @@
                         <w:t>LAB Instructor: Mr. Ali Hasan</w:t>
                       </w:r>
                     </w:p>
+                    <w:p>
+                      <w:pPr>
+                        <w:jc w:val="center"/>
+                        <w:rPr>
+                          <w:rFonts w:ascii="Sitka Text" w:hAnsi="Sitka Text"/>
+                          <w:b/>
+                          <w:color w:val="002060"/>
+                          <w:sz w:val="40"/>
+                          <w:szCs w:val="32"/>
+                        </w:rPr>
+                      </w:pPr>
+                      <w:r>
+                        <w:rPr>
+                          <w:rFonts w:ascii="Sitka Text" w:hAnsi="Sitka Text"/>
+                          <w:b/>
+                          <w:color w:val="002060"/>
+                          <w:sz w:val="40"/>
+                          <w:szCs w:val="32"/>
+                        </w:rPr>
+                        <w:t xml:space="preserve">Repository: </w:t>
+                      </w:r>
+                    </w:p>
+                    <w:p>
+                      <w:pPr>
+                        <w:jc w:val="center"/>
+                        <w:rPr>
+                          <w:rFonts w:ascii="Sitka Text" w:hAnsi="Sitka Text"/>
+                          <w:b/>
+                          <w:color w:val="002060"/>
+                          <w:sz w:val="40"/>
+                          <w:szCs w:val="32"/>
+                        </w:rPr>
+                      </w:pPr>
+                      <w:r>
+                        <w:rPr>
+                          <w:rFonts w:ascii="Sitka Text" w:hAnsi="Sitka Text"/>
+                          <w:b/>
+                          <w:color w:val="002060"/>
+                          <w:sz w:val="40"/>
+                          <w:szCs w:val="32"/>
+                        </w:rPr>
+                        <w:t>https://github.com/ismailkhan1707/athleteIQ.git</w:t>
+                      </w:r>
+                    </w:p>
+                    <w:p>
+                      <w:pPr>
+                        <w:jc w:val="center"/>
+                      </w:pPr>
+                    </w:p>
                     <w:p/>
                     <w:p/>
                   </w:txbxContent>
                 </v:textbox>
-                <w10:wrap type="tight"/>
+                <w10:wrap type="tight" anchorx="margin"/>
               </v:shape>
             </w:pict>
           </mc:Fallback>
         </mc:AlternateContent>
       </w:r>
+      <w:r>
+        <w:rPr>
+          <w:rFonts w:ascii="Microsoft Uighur" w:hAnsi="Microsoft Uighur" w:cs="Microsoft Uighur"/>
+          <w:b/>
+          <w:color w:val="003399"/>
+          <w:sz w:val="56"/>
+          <w:szCs w:val="36"/>
+        </w:rPr>
+        <w:t>Database Lab Project</w:t>
+      </w:r>
+    </w:p>
+    <w:p>
+      <w:pPr>
+        <w:rPr>
+          <w:rFonts w:ascii="Microsoft Uighur" w:hAnsi="Microsoft Uighur" w:cs="Microsoft Uighur"/>
+          <w:b/>
+          <w:color w:val="003399"/>
+          <w:sz w:val="48"/>
+          <w:szCs w:val="28"/>
+        </w:rPr>
+      </w:pPr>
     </w:p>
     <w:p>
       <w:pPr>
@@ -511,24 +617,6 @@
         </w:rPr>
       </w:pPr>
     </w:p>
-    <w:p>
-      <w:pPr>
-        <w:spacing w:after="0" w:line="240" w:lineRule="auto"/>
-        <w:rPr>
-          <w:rFonts w:ascii="Times New Roman" w:eastAsia="Times New Roman" w:hAnsi="Times New Roman" w:cs="Times New Roman"/>
-          <w:sz w:val="24"/>
-          <w:szCs w:val="24"/>
-        </w:rPr>
-      </w:pPr>
-      <w:r>
-        <w:rPr>
-          <w:rFonts w:ascii="Times New Roman" w:eastAsia="Times New Roman" w:hAnsi="Times New Roman" w:cs="Times New Roman"/>
-          <w:sz w:val="24"/>
-          <w:szCs w:val="24"/>
-        </w:rPr>
-        <w:br w:type="page"/>
-      </w:r>
-    </w:p>
     <w:tbl>
       <w:tblPr>
         <w:tblStyle w:val="GridTable4-Accent5"/>
@@ -565,10 +653,17 @@
             <w:r>
               <w:rPr>
                 <w:rFonts w:ascii="Times New Roman" w:eastAsia="Times New Roman" w:hAnsi="Times New Roman" w:cs="Times New Roman"/>
+                <w:sz w:val="24"/>
+                <w:szCs w:val="24"/>
+              </w:rPr>
+              <w:br w:type="page"/>
+            </w:r>
+            <w:r>
+              <w:rPr>
+                <w:rFonts w:ascii="Times New Roman" w:eastAsia="Times New Roman" w:hAnsi="Times New Roman" w:cs="Times New Roman"/>
                 <w:sz w:val="32"/>
                 <w:szCs w:val="32"/>
               </w:rPr>
-              <w:lastRenderedPageBreak/>
               <w:t>Milestones</w:t>
             </w:r>
           </w:p>
@@ -1123,6 +1218,14 @@
                 <w:szCs w:val="24"/>
               </w:rPr>
             </w:pPr>
+            <w:r>
+              <w:rPr>
+                <w:rFonts w:ascii="Times New Roman" w:eastAsia="Times New Roman" w:hAnsi="Times New Roman" w:cs="Times New Roman"/>
+                <w:sz w:val="24"/>
+                <w:szCs w:val="24"/>
+              </w:rPr>
+              <w:t xml:space="preserve"> </w:t>
+            </w:r>
           </w:p>
         </w:tc>
         <w:tc>
@@ -1527,13 +1630,23 @@
           <w:szCs w:val="24"/>
         </w:rPr>
       </w:pPr>
-      <w:r>
-        <w:rPr>
-          <w:rFonts w:ascii="Times New Roman" w:eastAsia="Times New Roman" w:hAnsi="Times New Roman" w:cs="Times New Roman"/>
-          <w:sz w:val="24"/>
-          <w:szCs w:val="24"/>
-        </w:rPr>
-        <w:t>athlete_id (PK)</w:t>
+      <w:proofErr w:type="spellStart"/>
+      <w:r>
+        <w:rPr>
+          <w:rFonts w:ascii="Times New Roman" w:eastAsia="Times New Roman" w:hAnsi="Times New Roman" w:cs="Times New Roman"/>
+          <w:sz w:val="24"/>
+          <w:szCs w:val="24"/>
+        </w:rPr>
+        <w:t>athlete_id</w:t>
+      </w:r>
+      <w:proofErr w:type="spellEnd"/>
+      <w:r>
+        <w:rPr>
+          <w:rFonts w:ascii="Times New Roman" w:eastAsia="Times New Roman" w:hAnsi="Times New Roman" w:cs="Times New Roman"/>
+          <w:sz w:val="24"/>
+          <w:szCs w:val="24"/>
+        </w:rPr>
+        <w:t xml:space="preserve"> (PK)</w:t>
       </w:r>
     </w:p>
     <w:p>
@@ -1550,6 +1663,7 @@
           <w:szCs w:val="24"/>
         </w:rPr>
       </w:pPr>
+      <w:proofErr w:type="spellStart"/>
       <w:r>
         <w:rPr>
           <w:rFonts w:ascii="Times New Roman" w:eastAsia="Times New Roman" w:hAnsi="Times New Roman" w:cs="Times New Roman"/>
@@ -1558,6 +1672,7 @@
         </w:rPr>
         <w:t>full_name</w:t>
       </w:r>
+      <w:proofErr w:type="spellEnd"/>
     </w:p>
     <w:p>
       <w:pPr>
@@ -1573,6 +1688,7 @@
           <w:szCs w:val="24"/>
         </w:rPr>
       </w:pPr>
+      <w:proofErr w:type="spellStart"/>
       <w:r>
         <w:rPr>
           <w:rFonts w:ascii="Times New Roman" w:eastAsia="Times New Roman" w:hAnsi="Times New Roman" w:cs="Times New Roman"/>
@@ -1581,6 +1697,7 @@
         </w:rPr>
         <w:t>date_of_birth</w:t>
       </w:r>
+      <w:proofErr w:type="spellEnd"/>
     </w:p>
     <w:p>
       <w:pPr>
@@ -1642,6 +1759,7 @@
           <w:szCs w:val="24"/>
         </w:rPr>
       </w:pPr>
+      <w:proofErr w:type="spellStart"/>
       <w:r>
         <w:rPr>
           <w:rFonts w:ascii="Times New Roman" w:eastAsia="Times New Roman" w:hAnsi="Times New Roman" w:cs="Times New Roman"/>
@@ -1650,6 +1768,7 @@
         </w:rPr>
         <w:t>contact_info</w:t>
       </w:r>
+      <w:proofErr w:type="spellEnd"/>
     </w:p>
     <w:p>
       <w:pPr>
@@ -1688,6 +1807,7 @@
           <w:szCs w:val="24"/>
         </w:rPr>
       </w:pPr>
+      <w:proofErr w:type="spellStart"/>
       <w:r>
         <w:rPr>
           <w:rFonts w:ascii="Times New Roman" w:eastAsia="Times New Roman" w:hAnsi="Times New Roman" w:cs="Times New Roman"/>
@@ -1696,6 +1816,7 @@
         </w:rPr>
         <w:t>created_at</w:t>
       </w:r>
+      <w:proofErr w:type="spellEnd"/>
     </w:p>
     <w:p>
       <w:pPr>
@@ -1743,15 +1864,91 @@
           <w:sz w:val="24"/>
           <w:szCs w:val="24"/>
         </w:rPr>
-        <w:t xml:space="preserve">Athletes to sports : </w:t>
-      </w:r>
-      <w:r>
-        <w:rPr>
-          <w:rFonts w:ascii="Times New Roman" w:eastAsia="Times New Roman" w:hAnsi="Times New Roman" w:cs="Times New Roman"/>
-          <w:sz w:val="24"/>
-          <w:szCs w:val="24"/>
-        </w:rPr>
-        <w:t>Many to many (M:N). Resolved through a junction table (Athletes_Enrollments).</w:t>
+        <w:t xml:space="preserve">Athletes to </w:t>
+      </w:r>
+      <w:proofErr w:type="gramStart"/>
+      <w:r>
+        <w:rPr>
+          <w:rFonts w:ascii="Times New Roman" w:eastAsia="Times New Roman" w:hAnsi="Times New Roman" w:cs="Times New Roman"/>
+          <w:b/>
+          <w:bCs/>
+          <w:sz w:val="24"/>
+          <w:szCs w:val="24"/>
+        </w:rPr>
+        <w:t>sports :</w:t>
+      </w:r>
+      <w:proofErr w:type="gramEnd"/>
+      <w:r>
+        <w:rPr>
+          <w:rFonts w:ascii="Times New Roman" w:eastAsia="Times New Roman" w:hAnsi="Times New Roman" w:cs="Times New Roman"/>
+          <w:b/>
+          <w:bCs/>
+          <w:sz w:val="24"/>
+          <w:szCs w:val="24"/>
+        </w:rPr>
+        <w:t xml:space="preserve"> </w:t>
+      </w:r>
+      <w:r>
+        <w:rPr>
+          <w:rFonts w:ascii="Times New Roman" w:eastAsia="Times New Roman" w:hAnsi="Times New Roman" w:cs="Times New Roman"/>
+          <w:sz w:val="24"/>
+          <w:szCs w:val="24"/>
+        </w:rPr>
+        <w:t xml:space="preserve">Many </w:t>
+      </w:r>
+      <w:proofErr w:type="gramStart"/>
+      <w:r>
+        <w:rPr>
+          <w:rFonts w:ascii="Times New Roman" w:eastAsia="Times New Roman" w:hAnsi="Times New Roman" w:cs="Times New Roman"/>
+          <w:sz w:val="24"/>
+          <w:szCs w:val="24"/>
+        </w:rPr>
+        <w:t>to</w:t>
+      </w:r>
+      <w:proofErr w:type="gramEnd"/>
+      <w:r>
+        <w:rPr>
+          <w:rFonts w:ascii="Times New Roman" w:eastAsia="Times New Roman" w:hAnsi="Times New Roman" w:cs="Times New Roman"/>
+          <w:sz w:val="24"/>
+          <w:szCs w:val="24"/>
+        </w:rPr>
+        <w:t xml:space="preserve"> many (</w:t>
+      </w:r>
+      <w:proofErr w:type="gramStart"/>
+      <w:r>
+        <w:rPr>
+          <w:rFonts w:ascii="Times New Roman" w:eastAsia="Times New Roman" w:hAnsi="Times New Roman" w:cs="Times New Roman"/>
+          <w:sz w:val="24"/>
+          <w:szCs w:val="24"/>
+        </w:rPr>
+        <w:t>M:N</w:t>
+      </w:r>
+      <w:proofErr w:type="gramEnd"/>
+      <w:r>
+        <w:rPr>
+          <w:rFonts w:ascii="Times New Roman" w:eastAsia="Times New Roman" w:hAnsi="Times New Roman" w:cs="Times New Roman"/>
+          <w:sz w:val="24"/>
+          <w:szCs w:val="24"/>
+        </w:rPr>
+        <w:t>). Resolved through a junction table (</w:t>
+      </w:r>
+      <w:proofErr w:type="spellStart"/>
+      <w:r>
+        <w:rPr>
+          <w:rFonts w:ascii="Times New Roman" w:eastAsia="Times New Roman" w:hAnsi="Times New Roman" w:cs="Times New Roman"/>
+          <w:sz w:val="24"/>
+          <w:szCs w:val="24"/>
+        </w:rPr>
+        <w:t>Athletes_Enrollments</w:t>
+      </w:r>
+      <w:proofErr w:type="spellEnd"/>
+      <w:r>
+        <w:rPr>
+          <w:rFonts w:ascii="Times New Roman" w:eastAsia="Times New Roman" w:hAnsi="Times New Roman" w:cs="Times New Roman"/>
+          <w:sz w:val="24"/>
+          <w:szCs w:val="24"/>
+        </w:rPr>
+        <w:t>).</w:t>
       </w:r>
     </w:p>
     <w:p>
@@ -1794,6 +1991,7 @@
         </w:rPr>
         <w:t xml:space="preserve">Athletes to </w:t>
       </w:r>
+      <w:proofErr w:type="spellStart"/>
       <w:r>
         <w:rPr>
           <w:rFonts w:ascii="Times New Roman" w:eastAsia="Times New Roman" w:hAnsi="Times New Roman" w:cs="Times New Roman"/>
@@ -1802,15 +2000,62 @@
           <w:sz w:val="24"/>
           <w:szCs w:val="24"/>
         </w:rPr>
-        <w:t xml:space="preserve">injury_records: </w:t>
-      </w:r>
-      <w:r>
-        <w:rPr>
-          <w:rFonts w:ascii="Times New Roman" w:eastAsia="Times New Roman" w:hAnsi="Times New Roman" w:cs="Times New Roman"/>
-          <w:sz w:val="24"/>
-          <w:szCs w:val="24"/>
-        </w:rPr>
-        <w:t>One to many (1:N) , one athlete can have multiple injuries.</w:t>
+        <w:t>injury_records</w:t>
+      </w:r>
+      <w:proofErr w:type="spellEnd"/>
+      <w:r>
+        <w:rPr>
+          <w:rFonts w:ascii="Times New Roman" w:eastAsia="Times New Roman" w:hAnsi="Times New Roman" w:cs="Times New Roman"/>
+          <w:b/>
+          <w:bCs/>
+          <w:sz w:val="24"/>
+          <w:szCs w:val="24"/>
+        </w:rPr>
+        <w:t xml:space="preserve">: </w:t>
+      </w:r>
+      <w:r>
+        <w:rPr>
+          <w:rFonts w:ascii="Times New Roman" w:eastAsia="Times New Roman" w:hAnsi="Times New Roman" w:cs="Times New Roman"/>
+          <w:sz w:val="24"/>
+          <w:szCs w:val="24"/>
+        </w:rPr>
+        <w:t xml:space="preserve">One </w:t>
+      </w:r>
+      <w:proofErr w:type="gramStart"/>
+      <w:r>
+        <w:rPr>
+          <w:rFonts w:ascii="Times New Roman" w:eastAsia="Times New Roman" w:hAnsi="Times New Roman" w:cs="Times New Roman"/>
+          <w:sz w:val="24"/>
+          <w:szCs w:val="24"/>
+        </w:rPr>
+        <w:t>to</w:t>
+      </w:r>
+      <w:proofErr w:type="gramEnd"/>
+      <w:r>
+        <w:rPr>
+          <w:rFonts w:ascii="Times New Roman" w:eastAsia="Times New Roman" w:hAnsi="Times New Roman" w:cs="Times New Roman"/>
+          <w:sz w:val="24"/>
+          <w:szCs w:val="24"/>
+        </w:rPr>
+        <w:t xml:space="preserve"> many (</w:t>
+      </w:r>
+      <w:proofErr w:type="gramStart"/>
+      <w:r>
+        <w:rPr>
+          <w:rFonts w:ascii="Times New Roman" w:eastAsia="Times New Roman" w:hAnsi="Times New Roman" w:cs="Times New Roman"/>
+          <w:sz w:val="24"/>
+          <w:szCs w:val="24"/>
+        </w:rPr>
+        <w:t>1:N) ,</w:t>
+      </w:r>
+      <w:proofErr w:type="gramEnd"/>
+      <w:r>
+        <w:rPr>
+          <w:rFonts w:ascii="Times New Roman" w:eastAsia="Times New Roman" w:hAnsi="Times New Roman" w:cs="Times New Roman"/>
+          <w:sz w:val="24"/>
+          <w:szCs w:val="24"/>
+        </w:rPr>
+        <w:t xml:space="preserve"> one athlete can have multiple injuries.</w:t>
       </w:r>
     </w:p>
     <w:p>
@@ -1863,15 +2108,73 @@
           <w:sz w:val="24"/>
           <w:szCs w:val="24"/>
         </w:rPr>
-        <w:t xml:space="preserve">Athletes to performance_stats: </w:t>
-      </w:r>
-      <w:r>
-        <w:rPr>
-          <w:rFonts w:ascii="Times New Roman" w:eastAsia="Times New Roman" w:hAnsi="Times New Roman" w:cs="Times New Roman"/>
-          <w:sz w:val="24"/>
-          <w:szCs w:val="24"/>
-        </w:rPr>
-        <w:t>One to many (1:N), One athlete can have multiple performance records.</w:t>
+        <w:t xml:space="preserve">Athletes to </w:t>
+      </w:r>
+      <w:proofErr w:type="spellStart"/>
+      <w:r>
+        <w:rPr>
+          <w:rFonts w:ascii="Times New Roman" w:eastAsia="Times New Roman" w:hAnsi="Times New Roman" w:cs="Times New Roman"/>
+          <w:b/>
+          <w:bCs/>
+          <w:sz w:val="24"/>
+          <w:szCs w:val="24"/>
+        </w:rPr>
+        <w:t>performance_stats</w:t>
+      </w:r>
+      <w:proofErr w:type="spellEnd"/>
+      <w:r>
+        <w:rPr>
+          <w:rFonts w:ascii="Times New Roman" w:eastAsia="Times New Roman" w:hAnsi="Times New Roman" w:cs="Times New Roman"/>
+          <w:b/>
+          <w:bCs/>
+          <w:sz w:val="24"/>
+          <w:szCs w:val="24"/>
+        </w:rPr>
+        <w:t xml:space="preserve">: </w:t>
+      </w:r>
+      <w:r>
+        <w:rPr>
+          <w:rFonts w:ascii="Times New Roman" w:eastAsia="Times New Roman" w:hAnsi="Times New Roman" w:cs="Times New Roman"/>
+          <w:sz w:val="24"/>
+          <w:szCs w:val="24"/>
+        </w:rPr>
+        <w:t xml:space="preserve">One </w:t>
+      </w:r>
+      <w:proofErr w:type="gramStart"/>
+      <w:r>
+        <w:rPr>
+          <w:rFonts w:ascii="Times New Roman" w:eastAsia="Times New Roman" w:hAnsi="Times New Roman" w:cs="Times New Roman"/>
+          <w:sz w:val="24"/>
+          <w:szCs w:val="24"/>
+        </w:rPr>
+        <w:t>to</w:t>
+      </w:r>
+      <w:proofErr w:type="gramEnd"/>
+      <w:r>
+        <w:rPr>
+          <w:rFonts w:ascii="Times New Roman" w:eastAsia="Times New Roman" w:hAnsi="Times New Roman" w:cs="Times New Roman"/>
+          <w:sz w:val="24"/>
+          <w:szCs w:val="24"/>
+        </w:rPr>
+        <w:t xml:space="preserve"> many (</w:t>
+      </w:r>
+      <w:proofErr w:type="gramStart"/>
+      <w:r>
+        <w:rPr>
+          <w:rFonts w:ascii="Times New Roman" w:eastAsia="Times New Roman" w:hAnsi="Times New Roman" w:cs="Times New Roman"/>
+          <w:sz w:val="24"/>
+          <w:szCs w:val="24"/>
+        </w:rPr>
+        <w:t>1:N</w:t>
+      </w:r>
+      <w:proofErr w:type="gramEnd"/>
+      <w:r>
+        <w:rPr>
+          <w:rFonts w:ascii="Times New Roman" w:eastAsia="Times New Roman" w:hAnsi="Times New Roman" w:cs="Times New Roman"/>
+          <w:sz w:val="24"/>
+          <w:szCs w:val="24"/>
+        </w:rPr>
+        <w:t>), One athlete can have multiple performance records.</w:t>
       </w:r>
     </w:p>
     <w:p>
@@ -2072,6 +2375,7 @@
           <w:szCs w:val="24"/>
         </w:rPr>
       </w:pPr>
+      <w:proofErr w:type="spellStart"/>
       <w:r>
         <w:rPr>
           <w:rFonts w:ascii="Times New Roman" w:eastAsia="Times New Roman" w:hAnsi="Times New Roman" w:cs="Times New Roman"/>
@@ -2080,6 +2384,7 @@
         </w:rPr>
         <w:t>sport_id</w:t>
       </w:r>
+      <w:proofErr w:type="spellEnd"/>
       <w:r>
         <w:rPr>
           <w:rFonts w:ascii="Times New Roman" w:eastAsia="Times New Roman" w:hAnsi="Times New Roman" w:cs="Times New Roman"/>
@@ -2185,15 +2490,73 @@
           <w:sz w:val="24"/>
           <w:szCs w:val="24"/>
         </w:rPr>
-        <w:t xml:space="preserve">Sports to performance_stats: </w:t>
-      </w:r>
-      <w:r>
-        <w:rPr>
-          <w:rFonts w:ascii="Times New Roman" w:eastAsia="Times New Roman" w:hAnsi="Times New Roman" w:cs="Times New Roman"/>
-          <w:sz w:val="24"/>
-          <w:szCs w:val="24"/>
-        </w:rPr>
-        <w:t>One to many (1:N), One sport can have multiple performance records.</w:t>
+        <w:t xml:space="preserve">Sports to </w:t>
+      </w:r>
+      <w:proofErr w:type="spellStart"/>
+      <w:r>
+        <w:rPr>
+          <w:rFonts w:ascii="Times New Roman" w:eastAsia="Times New Roman" w:hAnsi="Times New Roman" w:cs="Times New Roman"/>
+          <w:b/>
+          <w:bCs/>
+          <w:sz w:val="24"/>
+          <w:szCs w:val="24"/>
+        </w:rPr>
+        <w:t>performance_stats</w:t>
+      </w:r>
+      <w:proofErr w:type="spellEnd"/>
+      <w:r>
+        <w:rPr>
+          <w:rFonts w:ascii="Times New Roman" w:eastAsia="Times New Roman" w:hAnsi="Times New Roman" w:cs="Times New Roman"/>
+          <w:b/>
+          <w:bCs/>
+          <w:sz w:val="24"/>
+          <w:szCs w:val="24"/>
+        </w:rPr>
+        <w:t xml:space="preserve">: </w:t>
+      </w:r>
+      <w:r>
+        <w:rPr>
+          <w:rFonts w:ascii="Times New Roman" w:eastAsia="Times New Roman" w:hAnsi="Times New Roman" w:cs="Times New Roman"/>
+          <w:sz w:val="24"/>
+          <w:szCs w:val="24"/>
+        </w:rPr>
+        <w:t xml:space="preserve">One </w:t>
+      </w:r>
+      <w:proofErr w:type="gramStart"/>
+      <w:r>
+        <w:rPr>
+          <w:rFonts w:ascii="Times New Roman" w:eastAsia="Times New Roman" w:hAnsi="Times New Roman" w:cs="Times New Roman"/>
+          <w:sz w:val="24"/>
+          <w:szCs w:val="24"/>
+        </w:rPr>
+        <w:t>to</w:t>
+      </w:r>
+      <w:proofErr w:type="gramEnd"/>
+      <w:r>
+        <w:rPr>
+          <w:rFonts w:ascii="Times New Roman" w:eastAsia="Times New Roman" w:hAnsi="Times New Roman" w:cs="Times New Roman"/>
+          <w:sz w:val="24"/>
+          <w:szCs w:val="24"/>
+        </w:rPr>
+        <w:t xml:space="preserve"> many (</w:t>
+      </w:r>
+      <w:proofErr w:type="gramStart"/>
+      <w:r>
+        <w:rPr>
+          <w:rFonts w:ascii="Times New Roman" w:eastAsia="Times New Roman" w:hAnsi="Times New Roman" w:cs="Times New Roman"/>
+          <w:sz w:val="24"/>
+          <w:szCs w:val="24"/>
+        </w:rPr>
+        <w:t>1:N</w:t>
+      </w:r>
+      <w:proofErr w:type="gramEnd"/>
+      <w:r>
+        <w:rPr>
+          <w:rFonts w:ascii="Times New Roman" w:eastAsia="Times New Roman" w:hAnsi="Times New Roman" w:cs="Times New Roman"/>
+          <w:sz w:val="24"/>
+          <w:szCs w:val="24"/>
+        </w:rPr>
+        <w:t>), One sport can have multiple performance records.</w:t>
       </w:r>
     </w:p>
     <w:p>
@@ -2311,6 +2674,7 @@
         </w:rPr>
         <w:t xml:space="preserve">1.3 </w:t>
       </w:r>
+      <w:proofErr w:type="spellStart"/>
       <w:r>
         <w:rPr>
           <w:rFonts w:ascii="Times New Roman" w:eastAsia="Times New Roman" w:hAnsi="Times New Roman" w:cs="Times New Roman"/>
@@ -2321,6 +2685,7 @@
         </w:rPr>
         <w:t>Athlete_Enrollments</w:t>
       </w:r>
+      <w:proofErr w:type="spellEnd"/>
       <w:r>
         <w:rPr>
           <w:rFonts w:ascii="Times New Roman" w:eastAsia="Times New Roman" w:hAnsi="Times New Roman" w:cs="Times New Roman"/>
@@ -2359,13 +2724,41 @@
         </w:rPr>
         <w:t xml:space="preserve"> </w:t>
       </w:r>
-      <w:r>
-        <w:rPr>
-          <w:rFonts w:ascii="Times New Roman" w:eastAsia="Times New Roman" w:hAnsi="Times New Roman" w:cs="Times New Roman"/>
-          <w:sz w:val="24"/>
-          <w:szCs w:val="24"/>
-        </w:rPr>
-        <w:t>Records which athletes are enrolled in what sport and when.</w:t>
+      <w:proofErr w:type="gramStart"/>
+      <w:r>
+        <w:rPr>
+          <w:rFonts w:ascii="Times New Roman" w:eastAsia="Times New Roman" w:hAnsi="Times New Roman" w:cs="Times New Roman"/>
+          <w:sz w:val="24"/>
+          <w:szCs w:val="24"/>
+        </w:rPr>
+        <w:t>Records</w:t>
+      </w:r>
+      <w:proofErr w:type="gramEnd"/>
+      <w:r>
+        <w:rPr>
+          <w:rFonts w:ascii="Times New Roman" w:eastAsia="Times New Roman" w:hAnsi="Times New Roman" w:cs="Times New Roman"/>
+          <w:sz w:val="24"/>
+          <w:szCs w:val="24"/>
+        </w:rPr>
+        <w:t xml:space="preserve"> which athletes are enrolled </w:t>
+      </w:r>
+      <w:proofErr w:type="gramStart"/>
+      <w:r>
+        <w:rPr>
+          <w:rFonts w:ascii="Times New Roman" w:eastAsia="Times New Roman" w:hAnsi="Times New Roman" w:cs="Times New Roman"/>
+          <w:sz w:val="24"/>
+          <w:szCs w:val="24"/>
+        </w:rPr>
+        <w:t>in</w:t>
+      </w:r>
+      <w:proofErr w:type="gramEnd"/>
+      <w:r>
+        <w:rPr>
+          <w:rFonts w:ascii="Times New Roman" w:eastAsia="Times New Roman" w:hAnsi="Times New Roman" w:cs="Times New Roman"/>
+          <w:sz w:val="24"/>
+          <w:szCs w:val="24"/>
+        </w:rPr>
+        <w:t xml:space="preserve"> what sport and when.</w:t>
       </w:r>
     </w:p>
     <w:p>
@@ -2408,7 +2801,43 @@
           <w:sz w:val="24"/>
           <w:szCs w:val="24"/>
         </w:rPr>
-        <w:t>(sport_id, athlete_id) (PK)</w:t>
+        <w:t>(</w:t>
+      </w:r>
+      <w:proofErr w:type="spellStart"/>
+      <w:r>
+        <w:rPr>
+          <w:rFonts w:ascii="Times New Roman" w:eastAsia="Times New Roman" w:hAnsi="Times New Roman" w:cs="Times New Roman"/>
+          <w:sz w:val="24"/>
+          <w:szCs w:val="24"/>
+        </w:rPr>
+        <w:t>sport_id</w:t>
+      </w:r>
+      <w:proofErr w:type="spellEnd"/>
+      <w:r>
+        <w:rPr>
+          <w:rFonts w:ascii="Times New Roman" w:eastAsia="Times New Roman" w:hAnsi="Times New Roman" w:cs="Times New Roman"/>
+          <w:sz w:val="24"/>
+          <w:szCs w:val="24"/>
+        </w:rPr>
+        <w:t xml:space="preserve">, </w:t>
+      </w:r>
+      <w:proofErr w:type="spellStart"/>
+      <w:r>
+        <w:rPr>
+          <w:rFonts w:ascii="Times New Roman" w:eastAsia="Times New Roman" w:hAnsi="Times New Roman" w:cs="Times New Roman"/>
+          <w:sz w:val="24"/>
+          <w:szCs w:val="24"/>
+        </w:rPr>
+        <w:t>athlete_id</w:t>
+      </w:r>
+      <w:proofErr w:type="spellEnd"/>
+      <w:r>
+        <w:rPr>
+          <w:rFonts w:ascii="Times New Roman" w:eastAsia="Times New Roman" w:hAnsi="Times New Roman" w:cs="Times New Roman"/>
+          <w:sz w:val="24"/>
+          <w:szCs w:val="24"/>
+        </w:rPr>
+        <w:t>) (PK)</w:t>
       </w:r>
     </w:p>
     <w:p>
@@ -2425,13 +2854,23 @@
           <w:szCs w:val="24"/>
         </w:rPr>
       </w:pPr>
-      <w:r>
-        <w:rPr>
-          <w:rFonts w:ascii="Times New Roman" w:eastAsia="Times New Roman" w:hAnsi="Times New Roman" w:cs="Times New Roman"/>
-          <w:sz w:val="24"/>
-          <w:szCs w:val="24"/>
-        </w:rPr>
-        <w:t xml:space="preserve">sport_id (FK) </w:t>
+      <w:proofErr w:type="spellStart"/>
+      <w:r>
+        <w:rPr>
+          <w:rFonts w:ascii="Times New Roman" w:eastAsia="Times New Roman" w:hAnsi="Times New Roman" w:cs="Times New Roman"/>
+          <w:sz w:val="24"/>
+          <w:szCs w:val="24"/>
+        </w:rPr>
+        <w:t>sport_id</w:t>
+      </w:r>
+      <w:proofErr w:type="spellEnd"/>
+      <w:r>
+        <w:rPr>
+          <w:rFonts w:ascii="Times New Roman" w:eastAsia="Times New Roman" w:hAnsi="Times New Roman" w:cs="Times New Roman"/>
+          <w:sz w:val="24"/>
+          <w:szCs w:val="24"/>
+        </w:rPr>
+        <w:t xml:space="preserve"> (FK) </w:t>
       </w:r>
     </w:p>
     <w:p>
@@ -2448,13 +2887,23 @@
           <w:szCs w:val="24"/>
         </w:rPr>
       </w:pPr>
-      <w:r>
-        <w:rPr>
-          <w:rFonts w:ascii="Times New Roman" w:eastAsia="Times New Roman" w:hAnsi="Times New Roman" w:cs="Times New Roman"/>
-          <w:sz w:val="24"/>
-          <w:szCs w:val="24"/>
-        </w:rPr>
-        <w:t>athlete_id (FK)</w:t>
+      <w:proofErr w:type="spellStart"/>
+      <w:r>
+        <w:rPr>
+          <w:rFonts w:ascii="Times New Roman" w:eastAsia="Times New Roman" w:hAnsi="Times New Roman" w:cs="Times New Roman"/>
+          <w:sz w:val="24"/>
+          <w:szCs w:val="24"/>
+        </w:rPr>
+        <w:t>athlete_id</w:t>
+      </w:r>
+      <w:proofErr w:type="spellEnd"/>
+      <w:r>
+        <w:rPr>
+          <w:rFonts w:ascii="Times New Roman" w:eastAsia="Times New Roman" w:hAnsi="Times New Roman" w:cs="Times New Roman"/>
+          <w:sz w:val="24"/>
+          <w:szCs w:val="24"/>
+        </w:rPr>
+        <w:t xml:space="preserve"> (FK)</w:t>
       </w:r>
     </w:p>
     <w:p>
@@ -2471,6 +2920,7 @@
           <w:szCs w:val="24"/>
         </w:rPr>
       </w:pPr>
+      <w:proofErr w:type="spellStart"/>
       <w:r>
         <w:rPr>
           <w:rFonts w:ascii="Times New Roman" w:eastAsia="Times New Roman" w:hAnsi="Times New Roman" w:cs="Times New Roman"/>
@@ -2479,6 +2929,7 @@
         </w:rPr>
         <w:t>enrolled_on</w:t>
       </w:r>
+      <w:proofErr w:type="spellEnd"/>
     </w:p>
     <w:p>
       <w:pPr>
@@ -2619,6 +3070,7 @@
         </w:rPr>
         <w:t xml:space="preserve">1.4 </w:t>
       </w:r>
+      <w:proofErr w:type="spellStart"/>
       <w:r>
         <w:rPr>
           <w:rFonts w:ascii="Times New Roman" w:eastAsia="Times New Roman" w:hAnsi="Times New Roman" w:cs="Times New Roman"/>
@@ -2629,6 +3081,7 @@
         </w:rPr>
         <w:t>Injury_Records</w:t>
       </w:r>
+      <w:proofErr w:type="spellEnd"/>
       <w:r>
         <w:rPr>
           <w:rFonts w:ascii="Times New Roman" w:eastAsia="Times New Roman" w:hAnsi="Times New Roman" w:cs="Times New Roman"/>
@@ -2710,6 +3163,7 @@
           <w:szCs w:val="24"/>
         </w:rPr>
       </w:pPr>
+      <w:proofErr w:type="spellStart"/>
       <w:r>
         <w:rPr>
           <w:rFonts w:ascii="Times New Roman" w:eastAsia="Times New Roman" w:hAnsi="Times New Roman" w:cs="Times New Roman"/>
@@ -2717,7 +3171,16 @@
           <w:szCs w:val="24"/>
         </w:rPr>
         <w:lastRenderedPageBreak/>
-        <w:t>injury_id (PK)</w:t>
+        <w:t>injury_id</w:t>
+      </w:r>
+      <w:proofErr w:type="spellEnd"/>
+      <w:r>
+        <w:rPr>
+          <w:rFonts w:ascii="Times New Roman" w:eastAsia="Times New Roman" w:hAnsi="Times New Roman" w:cs="Times New Roman"/>
+          <w:sz w:val="24"/>
+          <w:szCs w:val="24"/>
+        </w:rPr>
+        <w:t xml:space="preserve"> (PK)</w:t>
       </w:r>
     </w:p>
     <w:p>
@@ -2734,13 +3197,23 @@
           <w:szCs w:val="24"/>
         </w:rPr>
       </w:pPr>
-      <w:r>
-        <w:rPr>
-          <w:rFonts w:ascii="Times New Roman" w:eastAsia="Times New Roman" w:hAnsi="Times New Roman" w:cs="Times New Roman"/>
-          <w:sz w:val="24"/>
-          <w:szCs w:val="24"/>
-        </w:rPr>
-        <w:t>athlete_id (FK)</w:t>
+      <w:proofErr w:type="spellStart"/>
+      <w:r>
+        <w:rPr>
+          <w:rFonts w:ascii="Times New Roman" w:eastAsia="Times New Roman" w:hAnsi="Times New Roman" w:cs="Times New Roman"/>
+          <w:sz w:val="24"/>
+          <w:szCs w:val="24"/>
+        </w:rPr>
+        <w:t>athlete_id</w:t>
+      </w:r>
+      <w:proofErr w:type="spellEnd"/>
+      <w:r>
+        <w:rPr>
+          <w:rFonts w:ascii="Times New Roman" w:eastAsia="Times New Roman" w:hAnsi="Times New Roman" w:cs="Times New Roman"/>
+          <w:sz w:val="24"/>
+          <w:szCs w:val="24"/>
+        </w:rPr>
+        <w:t xml:space="preserve"> (FK)</w:t>
       </w:r>
     </w:p>
     <w:p>
@@ -2757,6 +3230,7 @@
           <w:szCs w:val="24"/>
         </w:rPr>
       </w:pPr>
+      <w:proofErr w:type="spellStart"/>
       <w:r>
         <w:rPr>
           <w:rFonts w:ascii="Times New Roman" w:eastAsia="Times New Roman" w:hAnsi="Times New Roman" w:cs="Times New Roman"/>
@@ -2765,6 +3239,7 @@
         </w:rPr>
         <w:t>injury_type</w:t>
       </w:r>
+      <w:proofErr w:type="spellEnd"/>
     </w:p>
     <w:p>
       <w:pPr>
@@ -2803,6 +3278,7 @@
           <w:szCs w:val="24"/>
         </w:rPr>
       </w:pPr>
+      <w:proofErr w:type="spellStart"/>
       <w:r>
         <w:rPr>
           <w:rFonts w:ascii="Times New Roman" w:eastAsia="Times New Roman" w:hAnsi="Times New Roman" w:cs="Times New Roman"/>
@@ -2811,6 +3287,7 @@
         </w:rPr>
         <w:t>date_occured</w:t>
       </w:r>
+      <w:proofErr w:type="spellEnd"/>
     </w:p>
     <w:p>
       <w:pPr>
@@ -2826,6 +3303,7 @@
           <w:szCs w:val="24"/>
         </w:rPr>
       </w:pPr>
+      <w:proofErr w:type="spellStart"/>
       <w:r>
         <w:rPr>
           <w:rFonts w:ascii="Times New Roman" w:eastAsia="Times New Roman" w:hAnsi="Times New Roman" w:cs="Times New Roman"/>
@@ -2834,6 +3312,7 @@
         </w:rPr>
         <w:t>recovery_status</w:t>
       </w:r>
+      <w:proofErr w:type="spellEnd"/>
     </w:p>
     <w:p>
       <w:pPr>
@@ -2963,6 +3442,7 @@
         </w:rPr>
         <w:t xml:space="preserve">1.5 </w:t>
       </w:r>
+      <w:proofErr w:type="spellStart"/>
       <w:r>
         <w:rPr>
           <w:rFonts w:ascii="Times New Roman" w:eastAsia="Times New Roman" w:hAnsi="Times New Roman" w:cs="Times New Roman"/>
@@ -2973,6 +3453,7 @@
         </w:rPr>
         <w:t>Performance_Stats</w:t>
       </w:r>
+      <w:proofErr w:type="spellEnd"/>
       <w:r>
         <w:rPr>
           <w:rFonts w:ascii="Times New Roman" w:eastAsia="Times New Roman" w:hAnsi="Times New Roman" w:cs="Times New Roman"/>
@@ -3054,13 +3535,23 @@
           <w:szCs w:val="24"/>
         </w:rPr>
       </w:pPr>
-      <w:r>
-        <w:rPr>
-          <w:rFonts w:ascii="Times New Roman" w:eastAsia="Times New Roman" w:hAnsi="Times New Roman" w:cs="Times New Roman"/>
-          <w:sz w:val="24"/>
-          <w:szCs w:val="24"/>
-        </w:rPr>
-        <w:t>stat_id (PK)</w:t>
+      <w:proofErr w:type="spellStart"/>
+      <w:r>
+        <w:rPr>
+          <w:rFonts w:ascii="Times New Roman" w:eastAsia="Times New Roman" w:hAnsi="Times New Roman" w:cs="Times New Roman"/>
+          <w:sz w:val="24"/>
+          <w:szCs w:val="24"/>
+        </w:rPr>
+        <w:t>stat_id</w:t>
+      </w:r>
+      <w:proofErr w:type="spellEnd"/>
+      <w:r>
+        <w:rPr>
+          <w:rFonts w:ascii="Times New Roman" w:eastAsia="Times New Roman" w:hAnsi="Times New Roman" w:cs="Times New Roman"/>
+          <w:sz w:val="24"/>
+          <w:szCs w:val="24"/>
+        </w:rPr>
+        <w:t xml:space="preserve"> (PK)</w:t>
       </w:r>
     </w:p>
     <w:p>
@@ -3077,13 +3568,23 @@
           <w:szCs w:val="24"/>
         </w:rPr>
       </w:pPr>
-      <w:r>
-        <w:rPr>
-          <w:rFonts w:ascii="Times New Roman" w:eastAsia="Times New Roman" w:hAnsi="Times New Roman" w:cs="Times New Roman"/>
-          <w:sz w:val="24"/>
-          <w:szCs w:val="24"/>
-        </w:rPr>
-        <w:t>athlete_id (FK)</w:t>
+      <w:proofErr w:type="spellStart"/>
+      <w:r>
+        <w:rPr>
+          <w:rFonts w:ascii="Times New Roman" w:eastAsia="Times New Roman" w:hAnsi="Times New Roman" w:cs="Times New Roman"/>
+          <w:sz w:val="24"/>
+          <w:szCs w:val="24"/>
+        </w:rPr>
+        <w:t>athlete_id</w:t>
+      </w:r>
+      <w:proofErr w:type="spellEnd"/>
+      <w:r>
+        <w:rPr>
+          <w:rFonts w:ascii="Times New Roman" w:eastAsia="Times New Roman" w:hAnsi="Times New Roman" w:cs="Times New Roman"/>
+          <w:sz w:val="24"/>
+          <w:szCs w:val="24"/>
+        </w:rPr>
+        <w:t xml:space="preserve"> (FK)</w:t>
       </w:r>
     </w:p>
     <w:p>
@@ -3100,13 +3601,23 @@
           <w:szCs w:val="24"/>
         </w:rPr>
       </w:pPr>
-      <w:r>
-        <w:rPr>
-          <w:rFonts w:ascii="Times New Roman" w:eastAsia="Times New Roman" w:hAnsi="Times New Roman" w:cs="Times New Roman"/>
-          <w:sz w:val="24"/>
-          <w:szCs w:val="24"/>
-        </w:rPr>
-        <w:t>sport_id (FK)</w:t>
+      <w:proofErr w:type="spellStart"/>
+      <w:r>
+        <w:rPr>
+          <w:rFonts w:ascii="Times New Roman" w:eastAsia="Times New Roman" w:hAnsi="Times New Roman" w:cs="Times New Roman"/>
+          <w:sz w:val="24"/>
+          <w:szCs w:val="24"/>
+        </w:rPr>
+        <w:t>sport_id</w:t>
+      </w:r>
+      <w:proofErr w:type="spellEnd"/>
+      <w:r>
+        <w:rPr>
+          <w:rFonts w:ascii="Times New Roman" w:eastAsia="Times New Roman" w:hAnsi="Times New Roman" w:cs="Times New Roman"/>
+          <w:sz w:val="24"/>
+          <w:szCs w:val="24"/>
+        </w:rPr>
+        <w:t xml:space="preserve"> (FK)</w:t>
       </w:r>
     </w:p>
     <w:p>
@@ -3123,6 +3634,7 @@
           <w:szCs w:val="24"/>
         </w:rPr>
       </w:pPr>
+      <w:proofErr w:type="spellStart"/>
       <w:r>
         <w:rPr>
           <w:rFonts w:ascii="Times New Roman" w:eastAsia="Times New Roman" w:hAnsi="Times New Roman" w:cs="Times New Roman"/>
@@ -3131,6 +3643,7 @@
         </w:rPr>
         <w:t>metric_name</w:t>
       </w:r>
+      <w:proofErr w:type="spellEnd"/>
     </w:p>
     <w:p>
       <w:pPr>
@@ -3169,6 +3682,7 @@
           <w:szCs w:val="24"/>
         </w:rPr>
       </w:pPr>
+      <w:proofErr w:type="spellStart"/>
       <w:r>
         <w:rPr>
           <w:rFonts w:ascii="Times New Roman" w:eastAsia="Times New Roman" w:hAnsi="Times New Roman" w:cs="Times New Roman"/>
@@ -3177,6 +3691,7 @@
         </w:rPr>
         <w:t>recorded_on</w:t>
       </w:r>
+      <w:proofErr w:type="spellEnd"/>
     </w:p>
     <w:p>
       <w:pPr>
@@ -3406,13 +3921,23 @@
           <w:szCs w:val="24"/>
         </w:rPr>
       </w:pPr>
-      <w:r>
-        <w:rPr>
-          <w:rFonts w:ascii="Times New Roman" w:eastAsia="Times New Roman" w:hAnsi="Times New Roman" w:cs="Times New Roman"/>
-          <w:sz w:val="24"/>
-          <w:szCs w:val="24"/>
-        </w:rPr>
-        <w:t>user_id (PK)</w:t>
+      <w:proofErr w:type="spellStart"/>
+      <w:r>
+        <w:rPr>
+          <w:rFonts w:ascii="Times New Roman" w:eastAsia="Times New Roman" w:hAnsi="Times New Roman" w:cs="Times New Roman"/>
+          <w:sz w:val="24"/>
+          <w:szCs w:val="24"/>
+        </w:rPr>
+        <w:t>user_id</w:t>
+      </w:r>
+      <w:proofErr w:type="spellEnd"/>
+      <w:r>
+        <w:rPr>
+          <w:rFonts w:ascii="Times New Roman" w:eastAsia="Times New Roman" w:hAnsi="Times New Roman" w:cs="Times New Roman"/>
+          <w:sz w:val="24"/>
+          <w:szCs w:val="24"/>
+        </w:rPr>
+        <w:t xml:space="preserve"> (PK)</w:t>
       </w:r>
     </w:p>
     <w:p>
@@ -3452,6 +3977,7 @@
           <w:szCs w:val="24"/>
         </w:rPr>
       </w:pPr>
+      <w:proofErr w:type="spellStart"/>
       <w:r>
         <w:rPr>
           <w:rFonts w:ascii="Times New Roman" w:eastAsia="Times New Roman" w:hAnsi="Times New Roman" w:cs="Times New Roman"/>
@@ -3460,6 +3986,7 @@
         </w:rPr>
         <w:t>password_hash</w:t>
       </w:r>
+      <w:proofErr w:type="spellEnd"/>
     </w:p>
     <w:p>
       <w:pPr>
@@ -3475,6 +4002,7 @@
           <w:szCs w:val="24"/>
         </w:rPr>
       </w:pPr>
+      <w:proofErr w:type="spellStart"/>
       <w:r>
         <w:rPr>
           <w:rFonts w:ascii="Times New Roman" w:eastAsia="Times New Roman" w:hAnsi="Times New Roman" w:cs="Times New Roman"/>
@@ -3483,6 +4011,7 @@
         </w:rPr>
         <w:t>created_at</w:t>
       </w:r>
+      <w:proofErr w:type="spellEnd"/>
     </w:p>
     <w:p>
       <w:pPr>

</xml_diff>

<commit_message>
Minor changes in Docx file
</commit_message>
<xml_diff>
--- a/AthleteIQ.docx
+++ b/AthleteIQ.docx
@@ -211,28 +211,6 @@
                                 <w:sz w:val="40"/>
                                 <w:szCs w:val="32"/>
                               </w:rPr>
-                              <w:t>LAB Instructor: Mr. Ali Hasan</w:t>
-                            </w:r>
-                          </w:p>
-                          <w:p>
-                            <w:pPr>
-                              <w:jc w:val="center"/>
-                              <w:rPr>
-                                <w:rFonts w:ascii="Sitka Text" w:hAnsi="Sitka Text"/>
-                                <w:b/>
-                                <w:color w:val="002060"/>
-                                <w:sz w:val="40"/>
-                                <w:szCs w:val="32"/>
-                              </w:rPr>
-                            </w:pPr>
-                            <w:r>
-                              <w:rPr>
-                                <w:rFonts w:ascii="Sitka Text" w:hAnsi="Sitka Text"/>
-                                <w:b/>
-                                <w:color w:val="002060"/>
-                                <w:sz w:val="40"/>
-                                <w:szCs w:val="32"/>
-                              </w:rPr>
                               <w:t xml:space="preserve">Repository: </w:t>
                             </w:r>
                           </w:p>
@@ -256,6 +234,28 @@
                                 <w:szCs w:val="32"/>
                               </w:rPr>
                               <w:t>https://github.com/ismailkhan1707/athleteIQ.git</w:t>
+                            </w:r>
+                          </w:p>
+                          <w:p>
+                            <w:pPr>
+                              <w:jc w:val="center"/>
+                              <w:rPr>
+                                <w:rFonts w:ascii="Sitka Text" w:hAnsi="Sitka Text"/>
+                                <w:b/>
+                                <w:color w:val="002060"/>
+                                <w:sz w:val="40"/>
+                                <w:szCs w:val="32"/>
+                              </w:rPr>
+                            </w:pPr>
+                            <w:r>
+                              <w:rPr>
+                                <w:rFonts w:ascii="Sitka Text" w:hAnsi="Sitka Text"/>
+                                <w:b/>
+                                <w:color w:val="002060"/>
+                                <w:sz w:val="40"/>
+                                <w:szCs w:val="32"/>
+                              </w:rPr>
+                              <w:t>LAB Instructor: Mr. Ali Hasan</w:t>
                             </w:r>
                           </w:p>
                           <w:p>
@@ -370,28 +370,6 @@
                           <w:sz w:val="40"/>
                           <w:szCs w:val="32"/>
                         </w:rPr>
-                        <w:t>LAB Instructor: Mr. Ali Hasan</w:t>
-                      </w:r>
-                    </w:p>
-                    <w:p>
-                      <w:pPr>
-                        <w:jc w:val="center"/>
-                        <w:rPr>
-                          <w:rFonts w:ascii="Sitka Text" w:hAnsi="Sitka Text"/>
-                          <w:b/>
-                          <w:color w:val="002060"/>
-                          <w:sz w:val="40"/>
-                          <w:szCs w:val="32"/>
-                        </w:rPr>
-                      </w:pPr>
-                      <w:r>
-                        <w:rPr>
-                          <w:rFonts w:ascii="Sitka Text" w:hAnsi="Sitka Text"/>
-                          <w:b/>
-                          <w:color w:val="002060"/>
-                          <w:sz w:val="40"/>
-                          <w:szCs w:val="32"/>
-                        </w:rPr>
                         <w:t xml:space="preserve">Repository: </w:t>
                       </w:r>
                     </w:p>
@@ -415,6 +393,28 @@
                           <w:szCs w:val="32"/>
                         </w:rPr>
                         <w:t>https://github.com/ismailkhan1707/athleteIQ.git</w:t>
+                      </w:r>
+                    </w:p>
+                    <w:p>
+                      <w:pPr>
+                        <w:jc w:val="center"/>
+                        <w:rPr>
+                          <w:rFonts w:ascii="Sitka Text" w:hAnsi="Sitka Text"/>
+                          <w:b/>
+                          <w:color w:val="002060"/>
+                          <w:sz w:val="40"/>
+                          <w:szCs w:val="32"/>
+                        </w:rPr>
+                      </w:pPr>
+                      <w:r>
+                        <w:rPr>
+                          <w:rFonts w:ascii="Sitka Text" w:hAnsi="Sitka Text"/>
+                          <w:b/>
+                          <w:color w:val="002060"/>
+                          <w:sz w:val="40"/>
+                          <w:szCs w:val="32"/>
+                        </w:rPr>
+                        <w:t>LAB Instructor: Mr. Ali Hasan</w:t>
                       </w:r>
                     </w:p>
                     <w:p>
@@ -1092,8 +1092,12 @@
           </w:tcPr>
           <w:p>
             <w:pPr>
+              <w:pStyle w:val="ListParagraph"/>
+              <w:numPr>
+                <w:ilvl w:val="0"/>
+                <w:numId w:val="10"/>
+              </w:numPr>
               <w:spacing w:after="0" w:line="240" w:lineRule="auto"/>
-              <w:jc w:val="center"/>
               <w:rPr>
                 <w:rFonts w:ascii="Times New Roman" w:eastAsia="Times New Roman" w:hAnsi="Times New Roman" w:cs="Times New Roman"/>
                 <w:sz w:val="24"/>
@@ -1106,7 +1110,7 @@
                 <w:sz w:val="24"/>
                 <w:szCs w:val="24"/>
               </w:rPr>
-              <w:t>4.</w:t>
+              <w:t xml:space="preserve">DDL scripts </w:t>
             </w:r>
             <w:r>
               <w:rPr>
@@ -1114,7 +1118,7 @@
                 <w:sz w:val="24"/>
                 <w:szCs w:val="24"/>
               </w:rPr>
-              <w:t xml:space="preserve"> </w:t>
+              <w:t xml:space="preserve">   </w:t>
             </w:r>
             <w:r>
               <w:rPr>
@@ -1122,7 +1126,23 @@
                 <w:sz w:val="24"/>
                 <w:szCs w:val="24"/>
               </w:rPr>
-              <w:t>DDL scripts implemented and EERD verified</w:t>
+              <w:t xml:space="preserve">implemented and </w:t>
+            </w:r>
+            <w:r>
+              <w:rPr>
+                <w:rFonts w:ascii="Times New Roman" w:eastAsia="Times New Roman" w:hAnsi="Times New Roman" w:cs="Times New Roman"/>
+                <w:sz w:val="24"/>
+                <w:szCs w:val="24"/>
+              </w:rPr>
+              <w:t xml:space="preserve">   </w:t>
+            </w:r>
+            <w:r>
+              <w:rPr>
+                <w:rFonts w:ascii="Times New Roman" w:eastAsia="Times New Roman" w:hAnsi="Times New Roman" w:cs="Times New Roman"/>
+                <w:sz w:val="24"/>
+                <w:szCs w:val="24"/>
+              </w:rPr>
+              <w:t>EERD verified</w:t>
             </w:r>
           </w:p>
         </w:tc>
@@ -1210,8 +1230,12 @@
           </w:tcPr>
           <w:p>
             <w:pPr>
+              <w:pStyle w:val="ListParagraph"/>
+              <w:numPr>
+                <w:ilvl w:val="0"/>
+                <w:numId w:val="10"/>
+              </w:numPr>
               <w:spacing w:after="0" w:line="240" w:lineRule="auto"/>
-              <w:jc w:val="center"/>
               <w:rPr>
                 <w:rFonts w:ascii="Times New Roman" w:eastAsia="Times New Roman" w:hAnsi="Times New Roman" w:cs="Times New Roman"/>
                 <w:sz w:val="24"/>
@@ -1224,7 +1248,7 @@
                 <w:sz w:val="24"/>
                 <w:szCs w:val="24"/>
               </w:rPr>
-              <w:t xml:space="preserve"> </w:t>
+              <w:t>Data population and screenshots taken</w:t>
             </w:r>
           </w:p>
         </w:tc>
@@ -1244,6 +1268,14 @@
                 <w:szCs w:val="24"/>
               </w:rPr>
             </w:pPr>
+            <w:r>
+              <w:rPr>
+                <w:rFonts w:ascii="Times New Roman" w:eastAsia="Times New Roman" w:hAnsi="Times New Roman" w:cs="Times New Roman"/>
+                <w:sz w:val="24"/>
+                <w:szCs w:val="24"/>
+              </w:rPr>
+              <w:t>V 1.4</w:t>
+            </w:r>
           </w:p>
         </w:tc>
         <w:tc>
@@ -1262,6 +1294,14 @@
                 <w:szCs w:val="24"/>
               </w:rPr>
             </w:pPr>
+            <w:r>
+              <w:rPr>
+                <w:rFonts w:ascii="Times New Roman" w:eastAsia="Times New Roman" w:hAnsi="Times New Roman" w:cs="Times New Roman"/>
+                <w:sz w:val="24"/>
+                <w:szCs w:val="24"/>
+              </w:rPr>
+              <w:t>15/5/26</w:t>
+            </w:r>
           </w:p>
         </w:tc>
         <w:tc>
@@ -1276,6 +1316,8 @@
               <w:cnfStyle w:val="000000100000" w:firstRow="0" w:lastRow="0" w:firstColumn="0" w:lastColumn="0" w:oddVBand="0" w:evenVBand="0" w:oddHBand="1" w:evenHBand="0" w:firstRowFirstColumn="0" w:firstRowLastColumn="0" w:lastRowFirstColumn="0" w:lastRowLastColumn="0"/>
               <w:rPr>
                 <w:rFonts w:ascii="Times New Roman" w:eastAsia="Times New Roman" w:hAnsi="Times New Roman" w:cs="Times New Roman"/>
+                <w:b/>
+                <w:bCs/>
                 <w:sz w:val="24"/>
                 <w:szCs w:val="24"/>
               </w:rPr>

</xml_diff>